<commit_message>
Drop cross-verification flag notes from Top Questions doc
Overlap across the 12 section docs is expected and fine, so these
editorial review notes aren't needed.
</commit_message>
<xml_diff>
--- a/output/NETS_Top_Questions.docx
+++ b/output/NETS_Top_Questions.docx
@@ -258,22 +258,6 @@
     </w:p>
     <w:p>
       <w:pPr>
-        <w:spacing w:after="160"/>
-      </w:pPr>
-      <w:r>
-        <w:rPr>
-          <w:rFonts w:ascii="Barlow" w:cs="Barlow" w:eastAsia="Barlow" w:hAnsi="Barlow"/>
-          <w:i/>
-          <w:iCs/>
-          <w:color w:val="E70033"/>
-          <w:sz w:val="18"/>
-          <w:szCs w:val="18"/>
-        </w:rPr>
-        <w:t xml:space="preserve">⚑ Cross-check against the dedicated “NETS Motoring Card” section once scraped.</w:t>
-      </w:r>
-    </w:p>
-    <w:p>
-      <w:pPr>
         <w:spacing w:after="60" w:before="220"/>
       </w:pPr>
       <w:r>
@@ -1986,22 +1970,6 @@
           <w:szCs w:val="21"/>
         </w:rPr>
         <w:t xml:space="preserve">A misplaced NETS CashCard is deemed non-retrievable. There is no refund and no replacement for lost or stolen NETS CashCards.</w:t>
-      </w:r>
-    </w:p>
-    <w:p>
-      <w:pPr>
-        <w:spacing w:after="160"/>
-      </w:pPr>
-      <w:r>
-        <w:rPr>
-          <w:rFonts w:ascii="Barlow" w:cs="Barlow" w:eastAsia="Barlow" w:hAnsi="Barlow"/>
-          <w:i/>
-          <w:iCs/>
-          <w:color w:val="E70033"/>
-          <w:sz w:val="18"/>
-          <w:szCs w:val="18"/>
-        </w:rPr>
-        <w:t xml:space="preserve">⚑ References LTA's OBU migration announcement — confirm if this should be treated as externally-sourced policy content.</w:t>
       </w:r>
     </w:p>
     <w:p>

</xml_diff>